<commit_message>
Set 2 report: sync numbers and figures with notebook, UK English, remove em dashes, add GitHub URL
</commit_message>
<xml_diff>
--- a/Set 2/GAN_Assignment_Report_Set 2.docx
+++ b/Set 2/GAN_Assignment_Report_Set 2.docx
@@ -70,7 +70,7 @@
           <w:rFonts w:ascii="Times New Roman" w:hAnsi="Times New Roman" w:cs="Times New Roman"/>
           <w:b/>
         </w:rPr>
-        <w:t>Github URL:</w:t>
+        <w:t>Github URL: https://github.com/nithinreddy2003/GAN_Assignments</w:t>
       </w:r>
     </w:p>
     <w:p>
@@ -218,7 +218,7 @@
         </w:rPr>
         <w:drawing>
           <wp:inline distT="0" distB="0" distL="0" distR="0" wp14:anchorId="76E88F78" wp14:editId="4A31C9C5">
-            <wp:extent cx="1524000" cy="1555393"/>
+            <wp:extent cx="2150266" cy="2194560"/>
             <wp:effectExtent l="0" t="0" r="0" b="0"/>
             <wp:docPr id="101" name="image1.png"/>
             <wp:cNvGraphicFramePr>
@@ -240,7 +240,7 @@
                   <pic:spPr>
                     <a:xfrm>
                       <a:off x="0" y="0"/>
-                      <a:ext cx="1558384" cy="1590485"/>
+                      <a:ext cx="2150266" cy="2194560"/>
                     </a:xfrm>
                     <a:prstGeom prst="rect">
                       <a:avLst/>
@@ -292,16 +292,7 @@
           <w:sz w:val="20"/>
           <w:szCs w:val="20"/>
         </w:rPr>
-        <w:t xml:space="preserve">Figure 1 shows generated points lying along the true curve with only minor scatter near the turning points, where nonlinearity is greatest. The losses settle at equilibrium and hold — discriminator around 1.38, generator around </w:t>
-      </w:r>
-      <w:r>
-        <w:rPr>
-          <w:rFonts w:ascii="Times New Roman" w:hAnsi="Times New Roman" w:cs="Times New Roman"/>
-          <w:sz w:val="20"/>
-          <w:szCs w:val="20"/>
-        </w:rPr>
-        <w:lastRenderedPageBreak/>
-        <w:t>0.70 (final D=1.3778, G=0.6964). A discriminator loss near 2·ln(2) ≈ 1.386 signals a balanced game in which it can no longer separate real from fake, so the pipeline behaves as intended.</w:t>
+        <w:t xml:space="preserve">Figure 1 shows generated points lying along the true curve, with only minor scatter near the turning points where the nonlinearity is greatest. The losses settle at equilibrium and hold, with the discriminator around 1.38 and the generator around 0.70 (final D=1.3778, G=0.6964). A discriminator loss near 2*ln(2), about 1.386, signals a balanced game in which it can no longer separate real from fake, so the pipeline behaves as intended.</w:t>
       </w:r>
     </w:p>
     <w:p>
@@ -336,41 +327,7 @@
           <w:sz w:val="20"/>
           <w:szCs w:val="20"/>
         </w:rPr>
-        <w:t xml:space="preserve">For the new distribution I chose a </w:t>
-      </w:r>
-      <w:r>
-        <w:rPr>
-          <w:rFonts w:ascii="Times New Roman" w:hAnsi="Times New Roman" w:cs="Times New Roman"/>
-          <w:b/>
-          <w:sz w:val="20"/>
-          <w:szCs w:val="20"/>
-        </w:rPr>
-        <w:t>mixture of Gaussians</w:t>
-      </w:r>
-      <w:r>
-        <w:rPr>
-          <w:rFonts w:ascii="Times New Roman" w:hAnsi="Times New Roman" w:cs="Times New Roman"/>
-          <w:sz w:val="20"/>
-          <w:szCs w:val="20"/>
-        </w:rPr>
-        <w:t xml:space="preserve">: eight isotropic modes on a ring of radius 2.0 with per-mode std 0.05, trained for 8,000 steps. A ring of well-separated modes is the standard probe for </w:t>
-      </w:r>
-      <w:r>
-        <w:rPr>
-          <w:rFonts w:ascii="Times New Roman" w:hAnsi="Times New Roman" w:cs="Times New Roman"/>
-          <w:i/>
-          <w:sz w:val="20"/>
-          <w:szCs w:val="20"/>
-        </w:rPr>
-        <w:t>mode collapse</w:t>
-      </w:r>
-      <w:r>
-        <w:rPr>
-          <w:rFonts w:ascii="Times New Roman" w:hAnsi="Times New Roman" w:cs="Times New Roman"/>
-          <w:sz w:val="20"/>
-          <w:szCs w:val="20"/>
-        </w:rPr>
-        <w:t>, since a collapsed generator would cover only some of the eight blobs. Task 3 then changes only the network — from the 2×128 ReLU baseline to a deeper, wider 4×256 network with the self-normalising SELU activation (Klambauer et al., 2017), which keeps activations well-scaled in deeper stacks.</w:t>
+        <w:t xml:space="preserve">For the new distribution I chose a mixture of Gaussians: eight isotropic modes on a ring of radius 2.0 with per-mode standard deviation 0.05, trained for 8,000 steps. A ring of well-separated modes is the standard probe for mode collapse, since a collapsed generator would cover only some of the eight blobs. Task 3 then changes only the network, moving from the 2x128 ReLU baseline to a deeper, wider 4x256 network with the self-normalising SELU activation (Klambauer et al., 2017), which keeps activations well-scaled in deeper stacks.</w:t>
       </w:r>
     </w:p>
     <w:p>
@@ -392,7 +349,7 @@
         </w:rPr>
         <w:drawing>
           <wp:inline distT="0" distB="0" distL="0" distR="0" wp14:anchorId="4A3F2372" wp14:editId="09D91759">
-            <wp:extent cx="3543509" cy="1894115"/>
+            <wp:extent cx="4105575" cy="2194560"/>
             <wp:effectExtent l="0" t="0" r="0" b="0"/>
             <wp:docPr id="102" name="image2.png"/>
             <wp:cNvGraphicFramePr>
@@ -414,7 +371,7 @@
                   <pic:spPr>
                     <a:xfrm>
                       <a:off x="0" y="0"/>
-                      <a:ext cx="3621622" cy="1935869"/>
+                      <a:ext cx="4105575" cy="2194560"/>
                     </a:xfrm>
                     <a:prstGeom prst="rect">
                       <a:avLst/>
@@ -468,41 +425,7 @@
           <w:sz w:val="20"/>
           <w:szCs w:val="20"/>
         </w:rPr>
-        <w:t xml:space="preserve">Figure 2 captures both tasks at once. The baseline (left) reaches all eight modes — </w:t>
-      </w:r>
-      <w:r>
-        <w:rPr>
-          <w:rFonts w:ascii="Times New Roman" w:hAnsi="Times New Roman" w:cs="Times New Roman"/>
-          <w:i/>
-          <w:sz w:val="20"/>
-          <w:szCs w:val="20"/>
-        </w:rPr>
-        <w:t>no hard mode collapse</w:t>
-      </w:r>
-      <w:r>
-        <w:rPr>
-          <w:rFonts w:ascii="Times New Roman" w:hAnsi="Times New Roman" w:cs="Times New Roman"/>
-          <w:sz w:val="20"/>
-          <w:szCs w:val="20"/>
-        </w:rPr>
-        <w:t xml:space="preserve"> — but the red cloud is loose, filling the gaps between blobs rather than sitting on the centres: the classic "covers the modes but not sharply" behaviour of a small vanilla GAN. The enhanced network (right) tightens the samples onto the mode centres and traces a clean ring. Losses stay stable in both cases (enhanced ends at D=1.4444, G=0.8657), so the extra depth, width and smoother activation buy </w:t>
-      </w:r>
-      <w:r>
-        <w:rPr>
-          <w:rFonts w:ascii="Times New Roman" w:hAnsi="Times New Roman" w:cs="Times New Roman"/>
-          <w:i/>
-          <w:sz w:val="20"/>
-          <w:szCs w:val="20"/>
-        </w:rPr>
-        <w:t>sample sharpness</w:t>
-      </w:r>
-      <w:r>
-        <w:rPr>
-          <w:rFonts w:ascii="Times New Roman" w:hAnsi="Times New Roman" w:cs="Times New Roman"/>
-          <w:sz w:val="20"/>
-          <w:szCs w:val="20"/>
-        </w:rPr>
-        <w:t xml:space="preserve"> rather than fixing a collapse that never occurred. The inference is that, for this target, capacity and activation control sharpness, not mode coverage.</w:t>
+        <w:t xml:space="preserve">Figure 2 captures both tasks at once. The baseline (left) reaches all eight modes, so there is no hard mode collapse, but the red cloud is loose and fills the gaps between blobs instead of sitting on the centres, the classic 'covers the modes but not sharply' behaviour of a small vanilla GAN. The enhanced network (right) tightens the samples onto the mode centres and traces a clean ring. Losses stay stable in both cases (enhanced ends at D=1.4444, G=0.8657), so the extra depth, width and smoother activation buy sample sharpness, not a fix for a collapse that never occurred. For this target, capacity and activation control sharpness while coverage was already fine.</w:t>
       </w:r>
     </w:p>
     <w:p>
@@ -553,7 +476,7 @@
           <w:sz w:val="20"/>
           <w:szCs w:val="20"/>
         </w:rPr>
-        <w:t>OCTMNIST is a MedMNIST subset of 28×28 grayscale retinal OCT scans in four diagnostic classes (Yang et al., 2023). I train a DCGAN, which suits images because it replaces dense layers with strided and transposed convolutions, adds BatchNorm and LeakyReLU/ReLU activations, and uses a weight-init recipe shown to stabilise image GANs (Radford et al., 2015). Images are worked at 32×32 (a clean power of two for the four conv stages) and scaled to [-1, 1] to match the generator's Tanh.</w:t>
+        <w:t>OCTMNIST is a MedMNIST subset of 28×28 greyscale retinal OCT scans in four diagnostic classes (Yang et al., 2023). I train a DCGAN, which suits images because it replaces dense layers with strided and transposed convolutions, adds BatchNorm and LeakyReLU/ReLU activations, and uses a weight-init recipe shown to stabilise image GANs (Radford et al., 2015). Images are worked at 32×32 (a clean power of two for the four conv stages) and scaled to [-1, 1] to match the generator's Tanh.</w:t>
       </w:r>
     </w:p>
     <w:p>
@@ -575,7 +498,7 @@
         </w:rPr>
         <w:drawing>
           <wp:inline distT="0" distB="0" distL="0" distR="0" wp14:anchorId="6AE58847" wp14:editId="449068BB">
-            <wp:extent cx="2302328" cy="1305098"/>
+            <wp:extent cx="3871429" cy="2194560"/>
             <wp:effectExtent l="0" t="0" r="0" b="0"/>
             <wp:docPr id="103" name="image3.png"/>
             <wp:cNvGraphicFramePr>
@@ -597,7 +520,7 @@
                   <pic:spPr>
                     <a:xfrm>
                       <a:off x="0" y="0"/>
-                      <a:ext cx="2344286" cy="1328882"/>
+                      <a:ext cx="3871429" cy="2194560"/>
                     </a:xfrm>
                     <a:prstGeom prst="rect">
                       <a:avLst/>
@@ -651,8 +574,7 @@
           <w:sz w:val="20"/>
           <w:szCs w:val="20"/>
         </w:rPr>
-        <w:lastRenderedPageBreak/>
-        <w:t>The data has four classes (choroidal neovascularization, diabetic macular edema, drusen, normal) and a training split of shape (97477, 28, 28). Figure 3 shows a marked imbalance of roughly 6:1, which matters for the conditional extension: without correction the minority classes barely train. The unconditional DCGAN uses a random 40,000-image subset.</w:t>
+        <w:t xml:space="preserve">The data have four classes (choroidal neovascularisation, diabetic macular oedema, drusen, normal) and a training split of shape (97477, 28, 28). Figure 3 shows a marked imbalance of roughly 6:1, which matters for the conditional extension, because without correction the minority classes barely train. The unconditional DCGAN uses a random 40,000-image subset.</w:t>
       </w:r>
     </w:p>
     <w:p>
@@ -674,7 +596,7 @@
         </w:rPr>
         <w:drawing>
           <wp:inline distT="0" distB="0" distL="0" distR="0" wp14:anchorId="4B8D8194" wp14:editId="1EF1EDB1">
-            <wp:extent cx="3657600" cy="2109325"/>
+            <wp:extent cx="3805401" cy="2194560"/>
             <wp:effectExtent l="0" t="0" r="0" b="0"/>
             <wp:docPr id="104" name="image4.png"/>
             <wp:cNvGraphicFramePr>
@@ -696,7 +618,7 @@
                   <pic:spPr>
                     <a:xfrm>
                       <a:off x="0" y="0"/>
-                      <a:ext cx="3701540" cy="2134665"/>
+                      <a:ext cx="3805401" cy="2194560"/>
                     </a:xfrm>
                     <a:prstGeom prst="rect">
                       <a:avLst/>
@@ -750,7 +672,7 @@
           <w:sz w:val="20"/>
           <w:szCs w:val="20"/>
         </w:rPr>
-        <w:t>Figure 4 tracks 40 epochs. Training starts unbalanced (D=0.39, G=5.35 at epoch 1), with the discriminator dominating, then moves into a closer back-and-forth (D≈0.9–1.1, G≈1.3–2.6) — the healthy shape of a DCGAN that is learning, not collapsing. The occasional spike (e.g. epoch 19, D=3.16) is normal adversarial oscillation, not divergence.</w:t>
+        <w:t xml:space="preserve">Figure 4 tracks 40 epochs. Training starts unbalanced (D=0.39, G=5.35 at epoch 1), with the discriminator dominating, then moves into a closer back-and-forth (D about 0.9 to 1.1, G about 1.3 to 2.6), the healthy shape of a DCGAN that is learning rather than collapsing. The occasional spike, for example epoch 19 at D=3.16, is normal adversarial oscillation and not divergence.</w:t>
       </w:r>
     </w:p>
     <w:p>
@@ -772,7 +694,7 @@
         </w:rPr>
         <w:drawing>
           <wp:inline distT="0" distB="0" distL="0" distR="0" wp14:anchorId="362D353B" wp14:editId="4686E771">
-            <wp:extent cx="5766439" cy="1624083"/>
+            <wp:extent cx="4206240" cy="1846318"/>
             <wp:effectExtent l="0" t="0" r="0" b="0"/>
             <wp:docPr id="105" name="image5.png"/>
             <wp:cNvGraphicFramePr>
@@ -795,7 +717,7 @@
                   <pic:spPr bwMode="auto">
                     <a:xfrm>
                       <a:off x="0" y="0"/>
-                      <a:ext cx="5820726" cy="1639373"/>
+                      <a:ext cx="4206240" cy="1846318"/>
                     </a:xfrm>
                     <a:prstGeom prst="rect">
                       <a:avLst/>
@@ -879,44 +801,27 @@
           <w:sz w:val="20"/>
           <w:szCs w:val="20"/>
         </w:rPr>
-        <w:t xml:space="preserve">Figure 5 compares real and generated scans, quantified with FID, which compares InceptionV3 feature statistics between the two sets (Heusel et al., 2017). The generator scores </w:t>
-      </w:r>
-      <w:r>
-        <w:rPr>
-          <w:rFonts w:ascii="Times New Roman" w:hAnsi="Times New Roman" w:cs="Times New Roman"/>
-          <w:b/>
-          <w:sz w:val="20"/>
-          <w:szCs w:val="20"/>
-        </w:rPr>
-        <w:t>FID = 43.70</w:t>
-      </w:r>
-      <w:r>
-        <w:rPr>
-          <w:rFonts w:ascii="Times New Roman" w:hAnsi="Times New Roman" w:cs="Times New Roman"/>
-          <w:sz w:val="20"/>
-          <w:szCs w:val="20"/>
-        </w:rPr>
-        <w:t>. Visually the fakes capture the bright curved retinal band over a darker background and are varied rather than collapsed, but are softer with occasionally smeared sub-layers — consistent with a mid-40s FID at 32×32 after 40 epochs. I read the score as directional, since Inception was trained on natural RGB photos, not grayscale scans.</w:t>
-      </w:r>
-    </w:p>
-    <w:p>
-      <w:pPr>
-        <w:spacing w:before="120" w:after="120"/>
-        <w:jc w:val="both"/>
-        <w:rPr>
-          <w:rFonts w:ascii="Times New Roman" w:hAnsi="Times New Roman" w:cs="Times New Roman"/>
-          <w:sz w:val="20"/>
-          <w:szCs w:val="20"/>
-        </w:rPr>
-      </w:pPr>
-      <w:r>
-        <w:rPr>
-          <w:rFonts w:ascii="Times New Roman" w:hAnsi="Times New Roman" w:cs="Times New Roman"/>
-          <w:b/>
-          <w:sz w:val="20"/>
-          <w:szCs w:val="20"/>
-        </w:rPr>
-        <w:t>Extension — conditional GAN.</w:t>
+        <w:t xml:space="preserve">Figure 5 compares real and generated scans, quantified with FID, which compares InceptionV3 feature statistics between the two sets (Heusel et al., 2017). The generator scores FID = 43.70. Visually the fakes capture the bright curved retinal band over a darker background and are varied and not collapsed, though they are softer with occasionally smeared sub-layers, consistent with a mid-40s FID at 32x32 after 40 epochs. I read the score as directional, since Inception was trained on natural RGB photos and not greyscale scans.</w:t>
+      </w:r>
+    </w:p>
+    <w:p>
+      <w:pPr>
+        <w:spacing w:before="120" w:after="120"/>
+        <w:jc w:val="both"/>
+        <w:rPr>
+          <w:rFonts w:ascii="Times New Roman" w:hAnsi="Times New Roman" w:cs="Times New Roman"/>
+          <w:sz w:val="20"/>
+          <w:szCs w:val="20"/>
+        </w:rPr>
+      </w:pPr>
+      <w:r>
+        <w:rPr>
+          <w:rFonts w:ascii="Times New Roman" w:hAnsi="Times New Roman" w:cs="Times New Roman"/>
+          <w:b/>
+          <w:sz w:val="20"/>
+          <w:szCs w:val="20"/>
+        </w:rPr>
+        <w:t>Extension - conditional GAN.</w:t>
       </w:r>
       <w:r>
         <w:rPr>
@@ -947,7 +852,7 @@
         <w:lastRenderedPageBreak/>
         <w:drawing>
           <wp:inline distT="0" distB="0" distL="0" distR="0" wp14:anchorId="1D3A8BFC" wp14:editId="069AB406">
-            <wp:extent cx="3886200" cy="2137410"/>
+            <wp:extent cx="3990109" cy="2194560"/>
             <wp:effectExtent l="0" t="0" r="0" b="0"/>
             <wp:docPr id="106" name="image6.png"/>
             <wp:cNvGraphicFramePr>
@@ -969,7 +874,7 @@
                   <pic:spPr>
                     <a:xfrm>
                       <a:off x="0" y="0"/>
-                      <a:ext cx="3892060" cy="2140633"/>
+                      <a:ext cx="3990109" cy="2194560"/>
                     </a:xfrm>
                     <a:prstGeom prst="rect">
                       <a:avLst/>
@@ -1039,53 +944,10 @@
       <w:r>
         <w:rPr>
           <w:rFonts w:ascii="Times New Roman" w:hAnsi="Times New Roman" w:cs="Times New Roman"/>
-          <w:b/>
-          <w:sz w:val="20"/>
-          <w:szCs w:val="20"/>
-        </w:rPr>
-        <w:t>Reflection, and the "generating ducks" question.</w:t>
-      </w:r>
-      <w:r>
-        <w:rPr>
-          <w:rFonts w:ascii="Times New Roman" w:hAnsi="Times New Roman" w:cs="Times New Roman"/>
-          <w:sz w:val="20"/>
-          <w:szCs w:val="20"/>
-        </w:rPr>
-        <w:t xml:space="preserve"> The point behind the "ducks" prompt is that the DCGAN has no idea it is looking at eyes — it only learns the statistics of a pile of 32×32 arrays. Swap in duck photos and the identical code learns those instead. That content-agnosticism is why the same recipe transfers across Part 2, but it is also the key limitation: the discriminator learns </w:t>
-      </w:r>
-      <w:r>
-        <w:rPr>
-          <w:rFonts w:ascii="Times New Roman" w:hAnsi="Times New Roman" w:cs="Times New Roman"/>
-          <w:i/>
-          <w:sz w:val="20"/>
-          <w:szCs w:val="20"/>
-        </w:rPr>
-        <w:t>real versus fake</w:t>
-      </w:r>
-      <w:r>
-        <w:rPr>
-          <w:rFonts w:ascii="Times New Roman" w:hAnsi="Times New Roman" w:cs="Times New Roman"/>
-          <w:sz w:val="20"/>
-          <w:szCs w:val="20"/>
-        </w:rPr>
-        <w:t xml:space="preserve">, never </w:t>
-      </w:r>
-      <w:r>
-        <w:rPr>
-          <w:rFonts w:ascii="Times New Roman" w:hAnsi="Times New Roman" w:cs="Times New Roman"/>
-          <w:i/>
-          <w:sz w:val="20"/>
-          <w:szCs w:val="20"/>
-        </w:rPr>
-        <w:t>anatomically plausible</w:t>
-      </w:r>
-      <w:r>
-        <w:rPr>
-          <w:rFonts w:ascii="Times New Roman" w:hAnsi="Times New Roman" w:cs="Times New Roman"/>
-          <w:sz w:val="20"/>
-          <w:szCs w:val="20"/>
-        </w:rPr>
-        <w:t>, so it can render convincing structure with no anatomical basis. Synthetic scans are fine for augmentation or teaching but should not feed a real diagnostic pipeline without expert review.</w:t>
+          <w:sz w:val="20"/>
+          <w:szCs w:val="20"/>
+        </w:rPr>
+        <w:t xml:space="preserve">The point behind the 'ducks' prompt is that the DCGAN has no idea it is looking at eyes; it only learns the statistics of a pile of 32x32 arrays. Swap in duck photos and the identical code learns those instead. That content-agnosticism is why the same recipe transfers across Part 2, but it is also the key limitation: the discriminator learns real versus fake and never anatomically plausible, so it can render convincing structure with no anatomical basis. Synthetic scans are fine for augmentation or teaching but should not feed a real diagnostic pipeline without expert review.</w:t>
       </w:r>
     </w:p>
     <w:p>
@@ -1101,7 +963,7 @@
           <w:rFonts w:ascii="Times New Roman" w:hAnsi="Times New Roman" w:cs="Times New Roman"/>
           <w:b/>
         </w:rPr>
-        <w:t>Part 2.2: Cybersecurity – Synthetic Traffic with CICIDS 2017</w:t>
+        <w:t>Part 2.2: Cybersecurity - Synthetic Traffic with CICIDS 2017</w:t>
       </w:r>
     </w:p>
     <w:p>
@@ -1176,7 +1038,7 @@
         </w:rPr>
         <w:drawing>
           <wp:inline distT="0" distB="0" distL="0" distR="0" wp14:anchorId="5E7FE95D" wp14:editId="6C286FF8">
-            <wp:extent cx="5943600" cy="1556752"/>
+            <wp:extent cx="4206240" cy="1101702"/>
             <wp:effectExtent l="0" t="0" r="0" b="0"/>
             <wp:docPr id="107" name="image7.png"/>
             <wp:cNvGraphicFramePr>
@@ -1198,7 +1060,7 @@
                   <pic:spPr>
                     <a:xfrm>
                       <a:off x="0" y="0"/>
-                      <a:ext cx="5943600" cy="1556752"/>
+                      <a:ext cx="4206240" cy="1101702"/>
                     </a:xfrm>
                     <a:prstGeom prst="rect">
                       <a:avLst/>
@@ -1252,50 +1114,7 @@
           <w:sz w:val="20"/>
           <w:szCs w:val="20"/>
         </w:rPr>
-        <w:t xml:space="preserve">Merging the eight files gives </w:t>
-      </w:r>
-      <w:r>
-        <w:rPr>
-          <w:rFonts w:ascii="Times New Roman" w:hAnsi="Times New Roman" w:cs="Times New Roman"/>
-          <w:b/>
-          <w:sz w:val="20"/>
-          <w:szCs w:val="20"/>
-        </w:rPr>
-        <w:t>2,830,743 flows × 80 columns</w:t>
-      </w:r>
-      <w:r>
-        <w:rPr>
-          <w:rFonts w:ascii="Times New Roman" w:hAnsi="Times New Roman" w:cs="Times New Roman"/>
-          <w:sz w:val="20"/>
-          <w:szCs w:val="20"/>
-        </w:rPr>
-        <w:t xml:space="preserve"> with </w:t>
-      </w:r>
-      <w:r>
-        <w:rPr>
-          <w:rFonts w:ascii="Times New Roman" w:hAnsi="Times New Roman" w:cs="Times New Roman"/>
-          <w:b/>
-          <w:sz w:val="20"/>
-          <w:szCs w:val="20"/>
-        </w:rPr>
-        <w:t>78 numeric features</w:t>
-      </w:r>
-      <w:r>
-        <w:rPr>
-          <w:rFonts w:ascii="Times New Roman" w:hAnsi="Times New Roman" w:cs="Times New Roman"/>
-          <w:sz w:val="20"/>
-          <w:szCs w:val="20"/>
-        </w:rPr>
-        <w:t xml:space="preserve">, needing 4,376 infinite and 1,358 missing values cleaned. Figure 7 shows BENIGN dominating so heavily that a log scale is needed to see the </w:t>
-      </w:r>
-      <w:r>
-        <w:rPr>
-          <w:rFonts w:ascii="Times New Roman" w:hAnsi="Times New Roman" w:cs="Times New Roman"/>
-          <w:sz w:val="20"/>
-          <w:szCs w:val="20"/>
-        </w:rPr>
-        <w:lastRenderedPageBreak/>
-        <w:t>attacks — an imbalance that foreshadows later difficulty with rare attacks. A label note: the brief says "DDoS", but Wednesday contains single-source DoS attacks (Hulk, GoldenEye, slowloris, Slowhttptest), so I treat it as BENIGN vs DoS and flag the mismatch deliberately. Wednesday's largest labels are BENIGN = 440,031 and DoS Hulk = 231,073. Features are standardised and clipped to ±5σ so outliers cannot destabilise training; the GAN trains on a 20,000-row sample for 60 epochs (ending D=1.0799, G=1.3983).</w:t>
+        <w:t xml:space="preserve">Merging the eight files gives 2,830,743 flows across 80 columns with 78 numeric features, needing 4,376 infinite and 1,358 missing values cleaned. Figure 7 shows BENIGN dominating so heavily that a log scale is needed to see the attacks, an imbalance that foreshadows later difficulty with rare attacks. A label note: the brief says 'DDoS', but Wednesday contains single-source DoS attacks (Hulk, GoldenEye, slowloris, Slowhttptest), so I treat it as BENIGN vs DoS and flag the mismatch deliberately. Wednesday's largest labels are BENIGN = 440,031 and DoS Hulk = 231,073. Features are standardised and clipped to plus or minus 5 sigma so outliers cannot destabilise training, and the GAN trains on a 20,000-row sample for 60 epochs (ending D=1.0189, G=1.4104).</w:t>
       </w:r>
     </w:p>
     <w:p>
@@ -1317,7 +1136,7 @@
         </w:rPr>
         <w:drawing>
           <wp:inline distT="0" distB="0" distL="0" distR="0" wp14:anchorId="665C7F78" wp14:editId="3FFC13E3">
-            <wp:extent cx="2941320" cy="2581352"/>
+            <wp:extent cx="2500590" cy="2194560"/>
             <wp:effectExtent l="0" t="0" r="0" b="0"/>
             <wp:docPr id="108" name="image8.png"/>
             <wp:cNvGraphicFramePr>
@@ -1339,7 +1158,7 @@
                   <pic:spPr>
                     <a:xfrm>
                       <a:off x="0" y="0"/>
-                      <a:ext cx="2945279" cy="2584826"/>
+                      <a:ext cx="2500590" cy="2194560"/>
                     </a:xfrm>
                     <a:prstGeom prst="rect">
                       <a:avLst/>
@@ -1393,44 +1212,27 @@
           <w:sz w:val="20"/>
           <w:szCs w:val="20"/>
         </w:rPr>
-        <w:t xml:space="preserve">Since a feature vector cannot be eyeballed, I evaluate alignment via PCA (linear) and t-SNE (nonlinear, local structure; van der Maaten and Hinton, 2008). Figure 8 shows the synthetic cloud sitting on the dense BENIGN region and pushing partway into the DoS clusters without reproducing their separate structure. Quantitatively, the average absolute per-feature gap (standardised) is </w:t>
-      </w:r>
-      <w:r>
-        <w:rPr>
-          <w:rFonts w:ascii="Times New Roman" w:hAnsi="Times New Roman" w:cs="Times New Roman"/>
-          <w:b/>
-          <w:sz w:val="20"/>
-          <w:szCs w:val="20"/>
-        </w:rPr>
-        <w:t>0.1057 on the means and 0.1975 on the standard deviations</w:t>
-      </w:r>
-      <w:r>
-        <w:rPr>
-          <w:rFonts w:ascii="Times New Roman" w:hAnsi="Times New Roman" w:cs="Times New Roman"/>
-          <w:sz w:val="20"/>
-          <w:szCs w:val="20"/>
-        </w:rPr>
-        <w:t>. So the generator matches where most traffic lives and typical feature values, but is smoother than the real data and misses the DoS tails — the usual result for a plain unconditional GAN on heavy-tailed, partly-binary features.</w:t>
-      </w:r>
-    </w:p>
-    <w:p>
-      <w:pPr>
-        <w:spacing w:before="120" w:after="120"/>
-        <w:jc w:val="both"/>
-        <w:rPr>
-          <w:rFonts w:ascii="Times New Roman" w:hAnsi="Times New Roman" w:cs="Times New Roman"/>
-          <w:sz w:val="20"/>
-          <w:szCs w:val="20"/>
-        </w:rPr>
-      </w:pPr>
-      <w:r>
-        <w:rPr>
-          <w:rFonts w:ascii="Times New Roman" w:hAnsi="Times New Roman" w:cs="Times New Roman"/>
-          <w:b/>
-          <w:sz w:val="20"/>
-          <w:szCs w:val="20"/>
-        </w:rPr>
-        <w:t>Extension — all days and generalisation.</w:t>
+        <w:t xml:space="preserve">Since a feature vector cannot be eyeballed, I evaluate alignment via PCA (linear) and t-SNE (nonlinear, local structure; van der Maaten and Hinton, 2008). Figure 8 shows the synthetic cloud sitting on the dense BENIGN region and pushing partway into the DoS clusters without reproducing their separate structure. Quantitatively, the average absolute per-feature gap (standardised) is 0.1387 on the means and 0.2480 on the standard deviations. So the generator matches where most traffic lives and the typical feature values, but is smoother than the real data and misses the DoS tails, the usual result for a plain unconditional GAN on heavy-tailed, partly-binary features.</w:t>
+      </w:r>
+    </w:p>
+    <w:p>
+      <w:pPr>
+        <w:spacing w:before="120" w:after="120"/>
+        <w:jc w:val="both"/>
+        <w:rPr>
+          <w:rFonts w:ascii="Times New Roman" w:hAnsi="Times New Roman" w:cs="Times New Roman"/>
+          <w:sz w:val="20"/>
+          <w:szCs w:val="20"/>
+        </w:rPr>
+      </w:pPr>
+      <w:r>
+        <w:rPr>
+          <w:rFonts w:ascii="Times New Roman" w:hAnsi="Times New Roman" w:cs="Times New Roman"/>
+          <w:b/>
+          <w:sz w:val="20"/>
+          <w:szCs w:val="20"/>
+        </w:rPr>
+        <w:t>Extension - all days and generalisation.</w:t>
       </w:r>
       <w:r>
         <w:rPr>
@@ -1460,7 +1262,7 @@
         </w:rPr>
         <w:drawing>
           <wp:inline distT="0" distB="0" distL="0" distR="0" wp14:anchorId="72A2085F" wp14:editId="6151A375">
-            <wp:extent cx="3152633" cy="2461582"/>
+            <wp:extent cx="2810647" cy="2194560"/>
             <wp:effectExtent l="0" t="0" r="0" b="0"/>
             <wp:docPr id="109" name="image9.png"/>
             <wp:cNvGraphicFramePr>
@@ -1482,7 +1284,7 @@
                   <pic:spPr>
                     <a:xfrm>
                       <a:off x="0" y="0"/>
-                      <a:ext cx="3160200" cy="2467490"/>
+                      <a:ext cx="2810647" cy="2194560"/>
                     </a:xfrm>
                     <a:prstGeom prst="rect">
                       <a:avLst/>
@@ -1536,42 +1338,7 @@
           <w:sz w:val="20"/>
           <w:szCs w:val="20"/>
         </w:rPr>
-        <w:lastRenderedPageBreak/>
-        <w:t xml:space="preserve">Figure 9 colours real points by family. The synthetic cloud leans to BENIGN and the large attack blobs while barely touching rare families — the comparison sample holds only 2 Bot, 11 Brute Force and 2 Web Attack real points, so there is almost nothing to learn from. Adding data slightly </w:t>
-      </w:r>
-      <w:r>
-        <w:rPr>
-          <w:rFonts w:ascii="Times New Roman" w:hAnsi="Times New Roman" w:cs="Times New Roman"/>
-          <w:i/>
-          <w:sz w:val="20"/>
-          <w:szCs w:val="20"/>
-        </w:rPr>
-        <w:t>improves</w:t>
-      </w:r>
-      <w:r>
-        <w:rPr>
-          <w:rFonts w:ascii="Times New Roman" w:hAnsi="Times New Roman" w:cs="Times New Roman"/>
-          <w:sz w:val="20"/>
-          <w:szCs w:val="20"/>
-        </w:rPr>
-        <w:t xml:space="preserve"> the mean-gap (0.1017 vs 0.1057) but </w:t>
-      </w:r>
-      <w:r>
-        <w:rPr>
-          <w:rFonts w:ascii="Times New Roman" w:hAnsi="Times New Roman" w:cs="Times New Roman"/>
-          <w:i/>
-          <w:sz w:val="20"/>
-          <w:szCs w:val="20"/>
-        </w:rPr>
-        <w:t>worsens</w:t>
-      </w:r>
-      <w:r>
-        <w:rPr>
-          <w:rFonts w:ascii="Times New Roman" w:hAnsi="Times New Roman" w:cs="Times New Roman"/>
-          <w:sz w:val="20"/>
-          <w:szCs w:val="20"/>
-        </w:rPr>
-        <w:t xml:space="preserve"> the std-gap (0.2762 vs 0.1975): more data sharpens averages but cannot cover the extra variance. A single unconditional GAN does not generalise across attack families; a conditional GAN or per-family models would follow. The "duck" point bites harder here — a synthetic flow can be statistically plausible yet physically impossible, which is why the overlap and per-feature-gap checks matter more than any visual inspection.</w:t>
+        <w:t xml:space="preserve">Figure 9 colours real points by family. The synthetic cloud leans to BENIGN and the large attack blobs while barely touching the rare families; the comparison sample holds only 2 Bot, 11 Brute Force and 2 Web Attack real points, so there is almost nothing to learn from. Adding data slightly improves the mean-gap (0.1009 vs 0.1387) but worsens the std-gap (0.3004 vs 0.2480): more data sharpens the averages yet cannot cover the extra variance. A single unconditional GAN does not generalise across attack families, so a conditional GAN or per-family models would follow. The 'duck' point bites harder here, since a synthetic flow can be statistically plausible yet physically impossible, which is why the overlap and per-feature-gap checks matter more than any visual inspection.</w:t>
       </w:r>
     </w:p>
     <w:p>
@@ -1587,26 +1354,26 @@
           <w:rFonts w:ascii="Times New Roman" w:hAnsi="Times New Roman" w:cs="Times New Roman"/>
           <w:b/>
         </w:rPr>
-        <w:t>Part 2.3: Creative AI – QuickDraw 'birthday cake' Subset</w:t>
-      </w:r>
-    </w:p>
-    <w:p>
-      <w:pPr>
-        <w:spacing w:before="120" w:after="120"/>
-        <w:jc w:val="both"/>
-        <w:rPr>
-          <w:rFonts w:ascii="Times New Roman" w:hAnsi="Times New Roman" w:cs="Times New Roman"/>
-          <w:sz w:val="20"/>
-          <w:szCs w:val="20"/>
-        </w:rPr>
-      </w:pPr>
-      <w:r>
-        <w:rPr>
-          <w:rFonts w:ascii="Times New Roman" w:hAnsi="Times New Roman" w:cs="Times New Roman"/>
-          <w:sz w:val="20"/>
-          <w:szCs w:val="20"/>
-        </w:rPr>
-        <w:t>The final task trains a DCGAN on QuickDraw 'birthday cake' — 28×28 grayscale sketch bitmaps (Ha and Eck, 2018). I implement it in TensorFlow/Keras in the model.fit style: functional-API generator and discriminator wrapped in a keras.Model subclass whose train_step performs the adversarial update, deliberately showing a different framework and style from earlier parts. The config is a 100-d latent vector, 48 base feature maps, Adam at lr = 0.00015 (β₁ = 0.5) and 35 epochs at batch 256; the generator has 677,952 parameters. Of 144,982 available sketches I train on a random 30,000.</w:t>
+        <w:t>Part 2.3: Creative AI - QuickDraw 'birthday cake' Subset</w:t>
+      </w:r>
+    </w:p>
+    <w:p>
+      <w:pPr>
+        <w:spacing w:before="120" w:after="120"/>
+        <w:jc w:val="both"/>
+        <w:rPr>
+          <w:rFonts w:ascii="Times New Roman" w:hAnsi="Times New Roman" w:cs="Times New Roman"/>
+          <w:sz w:val="20"/>
+          <w:szCs w:val="20"/>
+        </w:rPr>
+      </w:pPr>
+      <w:r>
+        <w:rPr>
+          <w:rFonts w:ascii="Times New Roman" w:hAnsi="Times New Roman" w:cs="Times New Roman"/>
+          <w:sz w:val="20"/>
+          <w:szCs w:val="20"/>
+        </w:rPr>
+        <w:t xml:space="preserve">The final task trains a DCGAN on the QuickDraw 'birthday cake' set of 28x28 greyscale sketch bitmaps (Ha and Eck, 2018). I implement it in TensorFlow/Keras in the model.fit style: a functional-API generator and discriminator wrapped in a keras.Model subclass whose train_step performs the adversarial update, deliberately showing a different framework and style from earlier parts. The config is a 100-d latent vector, 48 base feature maps, Adam at lr = 0.00015 (beta1 = 0.5) and 35 epochs at batch 256; the generator has 677,952 parameters. Of 144,982 available sketches I train on a random 30,000.</w:t>
       </w:r>
     </w:p>
     <w:p>
@@ -1628,7 +1395,7 @@
         </w:rPr>
         <w:drawing>
           <wp:inline distT="0" distB="0" distL="0" distR="0" wp14:anchorId="17F89386" wp14:editId="71B1EB72">
-            <wp:extent cx="3749040" cy="2063692"/>
+            <wp:extent cx="3986784" cy="2194560"/>
             <wp:effectExtent l="0" t="0" r="0" b="0"/>
             <wp:docPr id="110" name="image10.png"/>
             <wp:cNvGraphicFramePr>
@@ -1650,7 +1417,7 @@
                   <pic:spPr>
                     <a:xfrm>
                       <a:off x="0" y="0"/>
-                      <a:ext cx="3756069" cy="2067561"/>
+                      <a:ext cx="3986784" cy="2194560"/>
                     </a:xfrm>
                     <a:prstGeom prst="rect">
                       <a:avLst/>
@@ -1685,43 +1452,26 @@
           <w:sz w:val="20"/>
           <w:szCs w:val="20"/>
         </w:rPr>
-        <w:t>Figure 10. Real versus generated birthday-cake sketches, FID = 41.32.</w:t>
-      </w:r>
-    </w:p>
-    <w:p>
-      <w:pPr>
-        <w:spacing w:before="120" w:after="120"/>
-        <w:jc w:val="both"/>
-        <w:rPr>
-          <w:rFonts w:ascii="Times New Roman" w:hAnsi="Times New Roman" w:cs="Times New Roman"/>
-          <w:sz w:val="20"/>
-          <w:szCs w:val="20"/>
-        </w:rPr>
-      </w:pPr>
-      <w:r>
-        <w:rPr>
-          <w:rFonts w:ascii="Times New Roman" w:hAnsi="Times New Roman" w:cs="Times New Roman"/>
-          <w:sz w:val="20"/>
-          <w:szCs w:val="20"/>
-        </w:rPr>
-        <w:t xml:space="preserve">Figure 10 compares real and generated cakes; the model scores </w:t>
-      </w:r>
-      <w:r>
-        <w:rPr>
-          <w:rFonts w:ascii="Times New Roman" w:hAnsi="Times New Roman" w:cs="Times New Roman"/>
-          <w:b/>
-          <w:sz w:val="20"/>
-          <w:szCs w:val="20"/>
-        </w:rPr>
-        <w:t>FID = 41.32</w:t>
-      </w:r>
-      <w:r>
-        <w:rPr>
-          <w:rFonts w:ascii="Times New Roman" w:hAnsi="Times New Roman" w:cs="Times New Roman"/>
-          <w:sz w:val="20"/>
-          <w:szCs w:val="20"/>
-        </w:rPr>
-        <w:t xml:space="preserve"> using the same InceptionV3 approach as Part 2.1. The cakes are clearly recognisable — a rounded or rectangular body, candles, often a plate — with line-art faults (broken strokes, speckle) visible up close but not hiding the subject. Losses stay in a healthy back-and-forth (from d_loss=0.55, g_loss=2.84 at epoch 1), with only occasional spikes.</w:t>
+        <w:t>Figure 10. Real versus generated birthday-cake sketches, FID = 42.13.</w:t>
+      </w:r>
+    </w:p>
+    <w:p>
+      <w:pPr>
+        <w:spacing w:before="120" w:after="120"/>
+        <w:jc w:val="both"/>
+        <w:rPr>
+          <w:rFonts w:ascii="Times New Roman" w:hAnsi="Times New Roman" w:cs="Times New Roman"/>
+          <w:sz w:val="20"/>
+          <w:szCs w:val="20"/>
+        </w:rPr>
+      </w:pPr>
+      <w:r>
+        <w:rPr>
+          <w:rFonts w:ascii="Times New Roman" w:hAnsi="Times New Roman" w:cs="Times New Roman"/>
+          <w:sz w:val="20"/>
+          <w:szCs w:val="20"/>
+        </w:rPr>
+        <w:t xml:space="preserve">Figure 10 compares real and generated cakes; the model scores FID = 42.13 using the same InceptionV3 approach as Part 2.1. The cakes are clearly recognisable, showing a rounded or rectangular body, candles and often a plate, with line-art faults such as broken strokes and speckle visible up close but not hiding the subject. Losses stay in a healthy back-and-forth (from d_loss=0.55, g_loss=2.84 at epoch 1), with only occasional spikes.</w:t>
       </w:r>
     </w:p>
     <w:p>
@@ -1743,7 +1493,7 @@
         </w:rPr>
         <w:drawing>
           <wp:inline distT="0" distB="0" distL="0" distR="0" wp14:anchorId="58C53309" wp14:editId="2043CF9D">
-            <wp:extent cx="5943600" cy="1382817"/>
+            <wp:extent cx="4206240" cy="978609"/>
             <wp:effectExtent l="0" t="0" r="0" b="0"/>
             <wp:docPr id="111" name="image11.png"/>
             <wp:cNvGraphicFramePr>
@@ -1765,7 +1515,7 @@
                   <pic:spPr>
                     <a:xfrm>
                       <a:off x="0" y="0"/>
-                      <a:ext cx="5943600" cy="1382817"/>
+                      <a:ext cx="4206240" cy="978609"/>
                     </a:xfrm>
                     <a:prstGeom prst="rect">
                       <a:avLst/>
@@ -1819,36 +1569,27 @@
           <w:sz w:val="20"/>
           <w:szCs w:val="20"/>
         </w:rPr>
-        <w:t xml:space="preserve">Figure 11 shows fixed-noise samples at five epochs. Early snapshots are blurry blobs; later ones sharpen into cake outlines with candles — the qualitative counterpart to the losses stabilising. Tracking the same noise over time </w:t>
-      </w:r>
-      <w:r>
-        <w:rPr>
-          <w:rFonts w:ascii="Times New Roman" w:hAnsi="Times New Roman" w:cs="Times New Roman"/>
-          <w:sz w:val="20"/>
-          <w:szCs w:val="20"/>
-        </w:rPr>
-        <w:lastRenderedPageBreak/>
-        <w:t>separates genuine learning from mode-hopping: the samples evolve smoothly toward structure rather than jumping between shapes.</w:t>
-      </w:r>
-    </w:p>
-    <w:p>
-      <w:pPr>
-        <w:spacing w:before="120" w:after="120"/>
-        <w:jc w:val="both"/>
-        <w:rPr>
-          <w:rFonts w:ascii="Times New Roman" w:hAnsi="Times New Roman" w:cs="Times New Roman"/>
-          <w:sz w:val="20"/>
-          <w:szCs w:val="20"/>
-        </w:rPr>
-      </w:pPr>
-      <w:r>
-        <w:rPr>
-          <w:rFonts w:ascii="Times New Roman" w:hAnsi="Times New Roman" w:cs="Times New Roman"/>
-          <w:b/>
-          <w:sz w:val="20"/>
-          <w:szCs w:val="20"/>
-        </w:rPr>
-        <w:t>Extension — other categories and complexity.</w:t>
+        <w:t xml:space="preserve">Figure 11 shows fixed-noise samples at five epochs. Early snapshots are blurry blobs; later ones sharpen into cake outlines with candles, the qualitative counterpart to the losses stabilising. Tracking the same noise over time separates genuine learning from mode-hopping, since the samples evolve smoothly towards structure instead of jumping between shapes.</w:t>
+      </w:r>
+    </w:p>
+    <w:p>
+      <w:pPr>
+        <w:spacing w:before="120" w:after="120"/>
+        <w:jc w:val="both"/>
+        <w:rPr>
+          <w:rFonts w:ascii="Times New Roman" w:hAnsi="Times New Roman" w:cs="Times New Roman"/>
+          <w:sz w:val="20"/>
+          <w:szCs w:val="20"/>
+        </w:rPr>
+      </w:pPr>
+      <w:r>
+        <w:rPr>
+          <w:rFonts w:ascii="Times New Roman" w:hAnsi="Times New Roman" w:cs="Times New Roman"/>
+          <w:b/>
+          <w:sz w:val="20"/>
+          <w:szCs w:val="20"/>
+        </w:rPr>
+        <w:t>Extension - other categories and complexity.</w:t>
       </w:r>
       <w:r>
         <w:rPr>
@@ -1878,7 +1619,7 @@
         </w:rPr>
         <w:drawing>
           <wp:inline distT="0" distB="0" distL="0" distR="0" wp14:anchorId="648090BA" wp14:editId="6B7328A2">
-            <wp:extent cx="4312693" cy="1867215"/>
+            <wp:extent cx="4206240" cy="1821125"/>
             <wp:effectExtent l="0" t="0" r="0" b="0"/>
             <wp:docPr id="112" name="image12.png"/>
             <wp:cNvGraphicFramePr>
@@ -1900,7 +1641,7 @@
                   <pic:spPr>
                     <a:xfrm>
                       <a:off x="0" y="0"/>
-                      <a:ext cx="4328205" cy="1873931"/>
+                      <a:ext cx="4206240" cy="1821125"/>
                     </a:xfrm>
                     <a:prstGeom prst="rect">
                       <a:avLst/>
@@ -1957,41 +1698,7 @@
           <w:sz w:val="20"/>
           <w:szCs w:val="20"/>
         </w:rPr>
-        <w:t xml:space="preserve">Figure 12 reports </w:t>
-      </w:r>
-      <w:r>
-        <w:rPr>
-          <w:rFonts w:ascii="Times New Roman" w:hAnsi="Times New Roman" w:cs="Times New Roman"/>
-          <w:b/>
-          <w:sz w:val="20"/>
-          <w:szCs w:val="20"/>
-        </w:rPr>
-        <w:t>house = 37.39, cat = 41.22, cake = 41.32</w:t>
-      </w:r>
-      <w:r>
-        <w:rPr>
-          <w:rFonts w:ascii="Times New Roman" w:hAnsi="Times New Roman" w:cs="Times New Roman"/>
-          <w:sz w:val="20"/>
-          <w:szCs w:val="20"/>
-        </w:rPr>
-        <w:t xml:space="preserve">, while ink-fractions are nearly flat (0.2368, 0.2655, 0.2708). Since ink density barely varies, it cannot explain the FID differences. House is easiest, fitting intuition — houses are structurally rigid, whereas cats and cakes vary more in pose, tiers and candle count. So </w:t>
-      </w:r>
-      <w:r>
-        <w:rPr>
-          <w:rFonts w:ascii="Times New Roman" w:hAnsi="Times New Roman" w:cs="Times New Roman"/>
-          <w:i/>
-          <w:sz w:val="20"/>
-          <w:szCs w:val="20"/>
-        </w:rPr>
-        <w:t>shape variety</w:t>
-      </w:r>
-      <w:r>
-        <w:rPr>
-          <w:rFonts w:ascii="Times New Roman" w:hAnsi="Times New Roman" w:cs="Times New Roman"/>
-          <w:sz w:val="20"/>
-          <w:szCs w:val="20"/>
-        </w:rPr>
-        <w:t>, not ink coverage, drives difficulty; the cat–cake gap (0.10 FID) is small enough to sit within run-to-run noise, so I would not read it as a firm ranking.</w:t>
+        <w:t xml:space="preserve">Figure 12 reports house = 35.22, cat = 39.53, cake = 42.13, while the ink-fractions are nearly flat (0.2368, 0.2655, 0.2708). Since ink density barely varies, it cannot explain the FID differences. House is the easiest, which fits intuition, because houses are structurally rigid whereas cats and cakes vary more in pose, tiers and candle count. Shape variety, not ink coverage, drives the difficulty, and the ordering of house then cat then cake follows increasing structural variety.</w:t>
       </w:r>
     </w:p>
     <w:p>
@@ -2030,7 +1737,7 @@
           <w:sz w:val="20"/>
           <w:szCs w:val="20"/>
         </w:rPr>
-        <w:t>The same adversarial recipe adapted cleanly to very different data by changing only the input representation and network family. Part 1 confirmed the mechanics: an MLP learned a sine wave almost perfectly and reached every mode of a Gaussian ring, and adding depth/width with SELU sharpened samples without altering coverage. Part 2.1 produced plausible OCT scans (FID 43.70) and a stabilised conditional model that generates any class on demand. Part 2.2 matched the bulk of real traffic (gaps 0.1057/0.1975 on Wednesday) but missed attack tails, with the all-days run confirming one unconditional model cannot span many families. Part 2.3 generated recognisable cake sketches (FID 41.32) and showed difficulty tracks shape variety, not ink density.</w:t>
+        <w:t xml:space="preserve">The same adversarial recipe adapted cleanly to very different data by changing only the input representation and the network family. Part 1 confirmed the mechanics: an MLP learned a sine wave almost perfectly and reached every mode of a Gaussian ring, and adding depth and width with SELU sharpened the samples without altering coverage. Part 2.1 produced plausible OCT scans (FID 43.70) and a stabilised conditional model that generates any class on demand. Part 2.2 matched the bulk of real traffic (gaps 0.1387/0.2480 on Wednesday) but missed the attack tails, and the all-days run confirmed one unconditional model cannot span many families. Part 2.3 generated recognisable cake sketches (FID 42.13) and showed that difficulty tracks shape variety, not ink density.</w:t>
       </w:r>
     </w:p>
     <w:p>
@@ -2083,7 +1790,7 @@
           <w:sz w:val="20"/>
           <w:szCs w:val="20"/>
         </w:rPr>
-        <w:t xml:space="preserve">: ImageNet-based FID is only directional for grayscale scans and line-art, so a domain-specific extractor or a "train-on-synthetic, test-on-real" classifier would give a more trustworthy signal. Third, </w:t>
+        <w:t xml:space="preserve">: ImageNet-based FID is only directional for greyscale scans and line-art, so a domain-specific extractor or a "train-on-synthetic, test-on-real" classifier would give a more trustworthy signal. Third, </w:t>
       </w:r>
       <w:r>
         <w:rPr>
@@ -2190,7 +1897,7 @@
           <w:sz w:val="20"/>
           <w:szCs w:val="20"/>
         </w:rPr>
-        <w:t>. Montreal, pp. 2672–2680.</w:t>
+        <w:t>. Montreal, pp. 2672-2680.</w:t>
       </w:r>
     </w:p>
     <w:p>
@@ -2226,7 +1933,7 @@
           <w:sz w:val="20"/>
           <w:szCs w:val="20"/>
         </w:rPr>
-        <w:t>. Long Beach, CA, pp. 5767–5777.</w:t>
+        <w:t>. Long Beach, CA, pp. 5767-5777.</w:t>
       </w:r>
     </w:p>
     <w:p>
@@ -2299,7 +2006,7 @@
           <w:sz w:val="20"/>
           <w:szCs w:val="20"/>
         </w:rPr>
-        <w:t>. Long Beach, CA, pp. 6626–6637.</w:t>
+        <w:t>. Long Beach, CA, pp. 6626-6637.</w:t>
       </w:r>
     </w:p>
     <w:p>
@@ -2335,7 +2042,7 @@
           <w:sz w:val="20"/>
           <w:szCs w:val="20"/>
         </w:rPr>
-        <w:t>. Long Beach, CA, pp. 971–980.</w:t>
+        <w:t>. Long Beach, CA, pp. 971-980.</w:t>
       </w:r>
     </w:p>
     <w:p>
@@ -2443,7 +2150,7 @@
           <w:sz w:val="20"/>
           <w:szCs w:val="20"/>
         </w:rPr>
-        <w:t>. Funchal, pp. 108–116.</w:t>
+        <w:t>. Funchal, pp. 108-116.</w:t>
       </w:r>
     </w:p>
     <w:p>
@@ -2479,26 +2186,26 @@
           <w:sz w:val="20"/>
           <w:szCs w:val="20"/>
         </w:rPr>
-        <w:t>, 9, pp. 2579–2605.</w:t>
-      </w:r>
-    </w:p>
-    <w:p>
-      <w:pPr>
-        <w:spacing w:before="120" w:after="120"/>
-        <w:jc w:val="both"/>
-        <w:rPr>
-          <w:rFonts w:ascii="Times New Roman" w:hAnsi="Times New Roman" w:cs="Times New Roman"/>
-          <w:sz w:val="20"/>
-          <w:szCs w:val="20"/>
-        </w:rPr>
-      </w:pPr>
-      <w:r>
-        <w:rPr>
-          <w:rFonts w:ascii="Times New Roman" w:hAnsi="Times New Roman" w:cs="Times New Roman"/>
-          <w:sz w:val="20"/>
-          <w:szCs w:val="20"/>
-        </w:rPr>
-        <w:t xml:space="preserve">Yang, J. et al. (2023) 'MedMNIST v2 — a large-scale lightweight benchmark for 2D and 3D biomedical image classification', </w:t>
+        <w:t>, 9, pp. 2579-2605.</w:t>
+      </w:r>
+    </w:p>
+    <w:p>
+      <w:pPr>
+        <w:spacing w:before="120" w:after="120"/>
+        <w:jc w:val="both"/>
+        <w:rPr>
+          <w:rFonts w:ascii="Times New Roman" w:hAnsi="Times New Roman" w:cs="Times New Roman"/>
+          <w:sz w:val="20"/>
+          <w:szCs w:val="20"/>
+        </w:rPr>
+      </w:pPr>
+      <w:r>
+        <w:rPr>
+          <w:rFonts w:ascii="Times New Roman" w:hAnsi="Times New Roman" w:cs="Times New Roman"/>
+          <w:sz w:val="20"/>
+          <w:szCs w:val="20"/>
+        </w:rPr>
+        <w:t xml:space="preserve">Yang, J. et al. (2023) 'MedMNIST v2 - a large-scale lightweight benchmark for 2D and 3D biomedical image classification', </w:t>
       </w:r>
       <w:r>
         <w:rPr>

</xml_diff>

<commit_message>
Set 2 report: sentence-case headings, remove bold run-ins and negative parallelisms for AI-writing-rule compliance
</commit_message>
<xml_diff>
--- a/Set 2/GAN_Assignment_Report_Set 2.docx
+++ b/Set 2/GAN_Assignment_Report_Set 2.docx
@@ -148,7 +148,7 @@
           <w:rFonts w:ascii="Times New Roman" w:hAnsi="Times New Roman" w:cs="Times New Roman"/>
           <w:b/>
         </w:rPr>
-        <w:t>Part 1: Building and Understanding GANs from Scratch</w:t>
+        <w:t>Part 1: building and understanding GANs from scratch</w:t>
       </w:r>
     </w:p>
     <w:p>
@@ -183,7 +183,7 @@
           <w:rFonts w:ascii="Times New Roman" w:hAnsi="Times New Roman" w:cs="Times New Roman"/>
           <w:b/>
         </w:rPr>
-        <w:t>Task 1: Reproduce the sine-wave GAN</w:t>
+        <w:t>Task 1: reproduce the sine-wave GAN</w:t>
       </w:r>
     </w:p>
     <w:p>
@@ -308,7 +308,7 @@
           <w:rFonts w:ascii="Times New Roman" w:hAnsi="Times New Roman" w:cs="Times New Roman"/>
           <w:b/>
         </w:rPr>
-        <w:t>Task 2 and Task 3: A new 2D distribution and an architecture change</w:t>
+        <w:t>Task 2 and Task 3: a new 2D distribution and an architecture change</w:t>
       </w:r>
     </w:p>
     <w:p>
@@ -441,7 +441,7 @@
           <w:rFonts w:ascii="Times New Roman" w:hAnsi="Times New Roman" w:cs="Times New Roman"/>
           <w:b/>
         </w:rPr>
-        <w:t>Part 2: Real-World GAN Applications</w:t>
+        <w:t>Part 2: real-world GAN applications</w:t>
       </w:r>
     </w:p>
     <w:p>
@@ -672,7 +672,7 @@
           <w:sz w:val="20"/>
           <w:szCs w:val="20"/>
         </w:rPr>
-        <w:t xml:space="preserve">Figure 4 tracks 40 epochs. Training starts unbalanced (D=0.39, G=5.35 at epoch 1), with the discriminator dominating, then moves into a closer back-and-forth (D about 0.9 to 1.1, G about 1.3 to 2.6), the healthy shape of a DCGAN that is learning rather than collapsing. The occasional spike, for example epoch 19 at D=3.16, is normal adversarial oscillation and not divergence.</w:t>
+        <w:t xml:space="preserve">Figure 4 tracks 40 epochs. Training starts unbalanced (D=0.39, G=5.35 at epoch 1), with the discriminator dominating, then moves into a closer back-and-forth (D about 0.9 to 1.1, G about 1.3 to 2.6), the healthy shape of a DCGAN that is learning steadily and not collapsing. The occasional spike, for example epoch 19 at D=3.16, is normal adversarial oscillation and not divergence.</w:t>
       </w:r>
     </w:p>
     <w:p>
@@ -817,19 +817,10 @@
       <w:r>
         <w:rPr>
           <w:rFonts w:ascii="Times New Roman" w:hAnsi="Times New Roman" w:cs="Times New Roman"/>
-          <w:b/>
-          <w:sz w:val="20"/>
-          <w:szCs w:val="20"/>
-        </w:rPr>
-        <w:t>Extension - conditional GAN.</w:t>
-      </w:r>
-      <w:r>
-        <w:rPr>
-          <w:rFonts w:ascii="Times New Roman" w:hAnsi="Times New Roman" w:cs="Times New Roman"/>
-          <w:sz w:val="20"/>
-          <w:szCs w:val="20"/>
-        </w:rPr>
-        <w:t xml:space="preserve"> To generate a chosen class on demand I built a conditional DCGAN (Mirza and Osindero, 2014), embedding the label and concatenating it with the latent vector for the generator while adding it as a discriminator input channel.</w:t>
+          <w:sz w:val="20"/>
+          <w:szCs w:val="20"/>
+        </w:rPr>
+        <w:t xml:space="preserve">For the extension, to generate a chosen class on demand I built a conditional DCGAN (Mirza and Osindero, 2014), embedding the label and concatenating it with the latent vector for the generator while adding it as a discriminator input channel.</w:t>
       </w:r>
     </w:p>
     <w:p>
@@ -963,60 +954,26 @@
           <w:rFonts w:ascii="Times New Roman" w:hAnsi="Times New Roman" w:cs="Times New Roman"/>
           <w:b/>
         </w:rPr>
-        <w:t>Part 2.2: Cybersecurity - Synthetic Traffic with CICIDS 2017</w:t>
-      </w:r>
-    </w:p>
-    <w:p>
-      <w:pPr>
-        <w:spacing w:before="120" w:after="120"/>
-        <w:jc w:val="both"/>
-        <w:rPr>
-          <w:rFonts w:ascii="Times New Roman" w:hAnsi="Times New Roman" w:cs="Times New Roman"/>
-          <w:sz w:val="20"/>
-          <w:szCs w:val="20"/>
-        </w:rPr>
-      </w:pPr>
-      <w:r>
-        <w:rPr>
-          <w:rFonts w:ascii="Times New Roman" w:hAnsi="Times New Roman" w:cs="Times New Roman"/>
-          <w:sz w:val="20"/>
-          <w:szCs w:val="20"/>
-        </w:rPr>
-        <w:t xml:space="preserve">CICIDS 2017 stores each flow as roughly 78 numeric features rather than an image (Sharafaldin, Lashkari and Ghorbani, 2018). Because the data are tabular with no spatial locality, a convolutional DCGAN is inappropriate, so I use a </w:t>
-      </w:r>
-      <w:r>
-        <w:rPr>
-          <w:rFonts w:ascii="Times New Roman" w:hAnsi="Times New Roman" w:cs="Times New Roman"/>
-          <w:b/>
-          <w:sz w:val="20"/>
-          <w:szCs w:val="20"/>
-        </w:rPr>
-        <w:t>fully-connected GAN</w:t>
-      </w:r>
-      <w:r>
-        <w:rPr>
-          <w:rFonts w:ascii="Times New Roman" w:hAnsi="Times New Roman" w:cs="Times New Roman"/>
-          <w:sz w:val="20"/>
-          <w:szCs w:val="20"/>
-        </w:rPr>
-        <w:t xml:space="preserve"> that keeps the DCGAN </w:t>
-      </w:r>
-      <w:r>
-        <w:rPr>
-          <w:rFonts w:ascii="Times New Roman" w:hAnsi="Times New Roman" w:cs="Times New Roman"/>
-          <w:i/>
-          <w:sz w:val="20"/>
-          <w:szCs w:val="20"/>
-        </w:rPr>
-        <w:t>recipe</w:t>
-      </w:r>
-      <w:r>
-        <w:rPr>
-          <w:rFonts w:ascii="Times New Roman" w:hAnsi="Times New Roman" w:cs="Times New Roman"/>
-          <w:sz w:val="20"/>
-          <w:szCs w:val="20"/>
-        </w:rPr>
-        <w:t xml:space="preserve"> (adversarial BCEWithLogitsLoss, generator BatchNorm, a LeakyReLU discriminator with dropout, Adam, label smoothing) but uses dense layers and a linear output, since the standardised features are unbounded. Following the brief, I combine all per-day CSVs, then train on Wednesday.</w:t>
+        <w:t>Part 2.2: cybersecurity, synthetic traffic with CICIDS 2017</w:t>
+      </w:r>
+    </w:p>
+    <w:p>
+      <w:pPr>
+        <w:spacing w:before="120" w:after="120"/>
+        <w:jc w:val="both"/>
+        <w:rPr>
+          <w:rFonts w:ascii="Times New Roman" w:hAnsi="Times New Roman" w:cs="Times New Roman"/>
+          <w:sz w:val="20"/>
+          <w:szCs w:val="20"/>
+        </w:rPr>
+      </w:pPr>
+      <w:r>
+        <w:rPr>
+          <w:rFonts w:ascii="Times New Roman" w:hAnsi="Times New Roman" w:cs="Times New Roman"/>
+          <w:sz w:val="20"/>
+          <w:szCs w:val="20"/>
+        </w:rPr>
+        <w:t xml:space="preserve">CICIDS 2017 stores each flow as a vector of roughly 78 numeric features instead of an image (Sharafaldin, Lashkari and Ghorbani, 2018). Because the data are tabular with no spatial locality, a convolutional DCGAN is inappropriate, so I use a fully-connected GAN that keeps the DCGAN recipe (adversarial BCEWithLogitsLoss, generator BatchNorm, a LeakyReLU discriminator with dropout, Adam, label smoothing) but uses dense layers and a linear output, since the standardised features are unbounded. Following the brief, I combine all per-day CSVs, then train on Wednesday.</w:t>
       </w:r>
     </w:p>
     <w:p>
@@ -1228,19 +1185,10 @@
       <w:r>
         <w:rPr>
           <w:rFonts w:ascii="Times New Roman" w:hAnsi="Times New Roman" w:cs="Times New Roman"/>
-          <w:b/>
-          <w:sz w:val="20"/>
-          <w:szCs w:val="20"/>
-        </w:rPr>
-        <w:t>Extension - all days and generalisation.</w:t>
-      </w:r>
-      <w:r>
-        <w:rPr>
-          <w:rFonts w:ascii="Times New Roman" w:hAnsi="Times New Roman" w:cs="Times New Roman"/>
-          <w:sz w:val="20"/>
-          <w:szCs w:val="20"/>
-        </w:rPr>
-        <w:t xml:space="preserve"> Retraining on the full dataset (2,827,876 rows, 30,000 sampled) tests coverage across attack families.</w:t>
+          <w:sz w:val="20"/>
+          <w:szCs w:val="20"/>
+        </w:rPr>
+        <w:t xml:space="preserve">For the extension across all days, retraining on the full dataset (2,827,876 rows, 30,000 sampled) tests coverage across attack families.</w:t>
       </w:r>
     </w:p>
     <w:p>
@@ -1354,7 +1302,7 @@
           <w:rFonts w:ascii="Times New Roman" w:hAnsi="Times New Roman" w:cs="Times New Roman"/>
           <w:b/>
         </w:rPr>
-        <w:t>Part 2.3: Creative AI - QuickDraw 'birthday cake' Subset</w:t>
+        <w:t>Part 2.3: creative AI, QuickDraw 'birthday cake' subset</w:t>
       </w:r>
     </w:p>
     <w:p>
@@ -1585,19 +1533,10 @@
       <w:r>
         <w:rPr>
           <w:rFonts w:ascii="Times New Roman" w:hAnsi="Times New Roman" w:cs="Times New Roman"/>
-          <w:b/>
-          <w:sz w:val="20"/>
-          <w:szCs w:val="20"/>
-        </w:rPr>
-        <w:t>Extension - other categories and complexity.</w:t>
-      </w:r>
-      <w:r>
-        <w:rPr>
-          <w:rFonts w:ascii="Times New Roman" w:hAnsi="Times New Roman" w:cs="Times New Roman"/>
-          <w:sz w:val="20"/>
-          <w:szCs w:val="20"/>
-        </w:rPr>
-        <w:t xml:space="preserve"> I retrained the same model on two more categories and compared FID against an "ink fraction" complexity proxy.</w:t>
+          <w:sz w:val="20"/>
+          <w:szCs w:val="20"/>
+        </w:rPr>
+        <w:t xml:space="preserve">For the extension on other categories, I retrained the same model on two more classes and compared FID against an 'ink fraction' complexity proxy.</w:t>
       </w:r>
     </w:p>
     <w:p>
@@ -1718,7 +1657,7 @@
           <w:sz w:val="20"/>
           <w:szCs w:val="20"/>
         </w:rPr>
-        <w:t>Conclusions and Future Work</w:t>
+        <w:t>Conclusions and future work</w:t>
       </w:r>
     </w:p>
     <w:p>
@@ -1756,92 +1695,7 @@
           <w:sz w:val="20"/>
           <w:szCs w:val="20"/>
         </w:rPr>
-        <w:t xml:space="preserve">Three directions follow. First, </w:t>
-      </w:r>
-      <w:r>
-        <w:rPr>
-          <w:rFonts w:ascii="Times New Roman" w:hAnsi="Times New Roman" w:cs="Times New Roman"/>
-          <w:b/>
-          <w:sz w:val="20"/>
-          <w:szCs w:val="20"/>
-        </w:rPr>
-        <w:t>coverage of rare classes</w:t>
-      </w:r>
-      <w:r>
-        <w:rPr>
-          <w:rFonts w:ascii="Times New Roman" w:hAnsi="Times New Roman" w:cs="Times New Roman"/>
-          <w:sz w:val="20"/>
-          <w:szCs w:val="20"/>
-        </w:rPr>
-        <w:t xml:space="preserve">: both the OCT imbalance and CICIDS rare-attack failure point to conditional generation, per-class models or minority-aware sampling. Second, </w:t>
-      </w:r>
-      <w:r>
-        <w:rPr>
-          <w:rFonts w:ascii="Times New Roman" w:hAnsi="Times New Roman" w:cs="Times New Roman"/>
-          <w:b/>
-          <w:sz w:val="20"/>
-          <w:szCs w:val="20"/>
-        </w:rPr>
-        <w:t>better-matched evaluation</w:t>
-      </w:r>
-      <w:r>
-        <w:rPr>
-          <w:rFonts w:ascii="Times New Roman" w:hAnsi="Times New Roman" w:cs="Times New Roman"/>
-          <w:sz w:val="20"/>
-          <w:szCs w:val="20"/>
-        </w:rPr>
-        <w:t xml:space="preserve">: ImageNet-based FID is only directional for greyscale scans and line-art, so a domain-specific extractor or a "train-on-synthetic, test-on-real" classifier would give a more trustworthy signal. Third, </w:t>
-      </w:r>
-      <w:r>
-        <w:rPr>
-          <w:rFonts w:ascii="Times New Roman" w:hAnsi="Times New Roman" w:cs="Times New Roman"/>
-          <w:b/>
-          <w:sz w:val="20"/>
-          <w:szCs w:val="20"/>
-        </w:rPr>
-        <w:t>stronger objectives</w:t>
-      </w:r>
-      <w:r>
-        <w:rPr>
-          <w:rFonts w:ascii="Times New Roman" w:hAnsi="Times New Roman" w:cs="Times New Roman"/>
-          <w:sz w:val="20"/>
-          <w:szCs w:val="20"/>
-        </w:rPr>
-        <w:t xml:space="preserve">: a Wasserstein loss with gradient penalty (Gulrajani et al., 2017) would likely tighten the loose Gaussian-mixture and smoothed CICIDS distributions. The recurring lesson, framed by the "duck" question, is that a GAN learns </w:t>
-      </w:r>
-      <w:r>
-        <w:rPr>
-          <w:rFonts w:ascii="Times New Roman" w:hAnsi="Times New Roman" w:cs="Times New Roman"/>
-          <w:i/>
-          <w:sz w:val="20"/>
-          <w:szCs w:val="20"/>
-        </w:rPr>
-        <w:t>statistical</w:t>
-      </w:r>
-      <w:r>
-        <w:rPr>
-          <w:rFonts w:ascii="Times New Roman" w:hAnsi="Times New Roman" w:cs="Times New Roman"/>
-          <w:sz w:val="20"/>
-          <w:szCs w:val="20"/>
-        </w:rPr>
-        <w:t xml:space="preserve"> resemblance, never </w:t>
-      </w:r>
-      <w:r>
-        <w:rPr>
-          <w:rFonts w:ascii="Times New Roman" w:hAnsi="Times New Roman" w:cs="Times New Roman"/>
-          <w:i/>
-          <w:sz w:val="20"/>
-          <w:szCs w:val="20"/>
-        </w:rPr>
-        <w:t>semantic correctness</w:t>
-      </w:r>
-      <w:r>
-        <w:rPr>
-          <w:rFonts w:ascii="Times New Roman" w:hAnsi="Times New Roman" w:cs="Times New Roman"/>
-          <w:sz w:val="20"/>
-          <w:szCs w:val="20"/>
-        </w:rPr>
-        <w:t>, so synthetic medical or security data must be validated before it is trusted downstream.</w:t>
+        <w:t xml:space="preserve">Three directions follow. First, coverage of rare classes: both the OCT imbalance and the CICIDS rare-attack failure point to conditional generation, per-class models or minority-aware sampling. Second, better-matched evaluation: ImageNet-based FID is only directional for greyscale scans and line-art, so a domain-specific extractor or a 'train-on-synthetic, test-on-real' classifier would give a more trustworthy signal. Third, stronger objectives: a Wasserstein loss with gradient penalty (Gulrajani et al., 2017) would likely tighten the loose Gaussian-mixture and smoothed CICIDS distributions. The recurring lesson, framed by the 'duck' question, is that a GAN learns statistical resemblance, never semantic correctness, so synthetic medical or security data must be validated before it is trusted downstream.</w:t>
       </w:r>
     </w:p>
     <w:p>

</xml_diff>